<commit_message>
Manuales corregidos 9, 12, 13, 14
</commit_message>
<xml_diff>
--- a/TP2. E12 Manual del Administrador del Sistema.docx
+++ b/TP2. E12 Manual del Administrador del Sistema.docx
@@ -203,6 +203,35 @@
         </w:rPr>
         <w:t xml:space="preserve">Para consultar la información de los usuarios registrados en el sistema, puedes ejecutar la siguiente consulta en la base de datos:</w:t>
       </w:r>
+    </w:p>
+    <w:p>
+      <w:pPr>
+        <w:spacing w:after="240" w:before="240" w:line="240" w:lineRule="auto"/>
+        <w:jc w:val="left"/>
+        <w:rPr>
+          <w:b w:val="1"/>
+          <w:bCs w:val="1"/>
+        </w:rPr>
+      </w:pPr>
+      <w:r>
+        <w:rPr>
+          <w:b w:val="1"/>
+          <w:bCs w:val="1"/>
+          <w:rtl w:val="0"/>
+        </w:rPr>
+        <w:t xml:space="preserve">Capturas de pantalla.</w:t>
+      </w:r>
+    </w:p>
+    <w:p>
+      <w:pPr>
+        <w:spacing w:after="240" w:before="240" w:line="240" w:lineRule="auto"/>
+        <w:ind w:left="0" w:firstLine="0"/>
+        <w:jc w:val="left"/>
+        <w:rPr>
+          <w:b w:val="1"/>
+          <w:bCs w:val="1"/>
+        </w:rPr>
+      </w:pPr>
       <w:r>
         <w:rPr>
           <w:rtl w:val="0"/>
@@ -223,21 +252,44 @@
           <w:rFonts w:ascii="Consolas" w:cs="Consolas" w:eastAsia="Consolas" w:hAnsi="Consolas"/>
           <w:sz w:val="20"/>
           <w:szCs w:val="20"/>
-          <w:rtl w:val="0"/>
-        </w:rPr>
-        <w:t xml:space="preserve">SELECT * from usuarios;</w:t>
-      </w:r>
-    </w:p>
-    <w:p>
-      <w:pPr>
-        <w:pStyle w:val="Heading2"/>
-        <w:rPr/>
-      </w:pPr>
-      <w:r>
-        <w:rPr>
-          <w:rtl w:val="0"/>
-        </w:rPr>
-        <w:t xml:space="preserve">3.2 Eliminar Usuario</w:t>
+        </w:rPr>
+        <w:drawing>
+          <wp:inline distB="114300" distT="114300" distL="114300" distR="114300">
+            <wp:extent cx="4933950" cy="6191250"/>
+            <wp:effectExtent b="0" l="0" r="0" t="0"/>
+            <wp:docPr id="2" name="image2.png"/>
+            <a:graphic>
+              <a:graphicData uri="http://schemas.openxmlformats.org/drawingml/2006/picture">
+                <pic:pic>
+                  <pic:nvPicPr>
+                    <pic:cNvPr id="0" name="image2.png"/>
+                    <pic:cNvPicPr preferRelativeResize="0"/>
+                  </pic:nvPicPr>
+                  <pic:blipFill>
+                    <a:blip r:embed="rId6"/>
+                    <a:srcRect b="0" l="0" r="0" t="0"/>
+                    <a:stretch>
+                      <a:fillRect/>
+                    </a:stretch>
+                  </pic:blipFill>
+                  <pic:spPr>
+                    <a:xfrm>
+                      <a:off x="0" y="0"/>
+                      <a:ext cx="4933950" cy="6191250"/>
+                    </a:xfrm>
+                    <a:prstGeom prst="rect"/>
+                    <a:ln/>
+                  </pic:spPr>
+                </pic:pic>
+              </a:graphicData>
+            </a:graphic>
+          </wp:inline>
+        </w:drawing>
+      </w:r>
+      <w:r>
+        <w:rPr>
+          <w:rtl w:val="0"/>
+        </w:rPr>
       </w:r>
     </w:p>
     <w:p>
@@ -254,20 +306,59 @@
           <w:rFonts w:ascii="Consolas" w:cs="Consolas" w:eastAsia="Consolas" w:hAnsi="Consolas"/>
           <w:sz w:val="20"/>
           <w:szCs w:val="20"/>
-          <w:rtl w:val="0"/>
-        </w:rPr>
-        <w:t xml:space="preserve">DELETE FROM usuarios WHERE id = X;</w:t>
-      </w:r>
-    </w:p>
-    <w:p>
-      <w:pPr>
-        <w:rPr/>
-      </w:pPr>
-      <w:r>
-        <w:rPr>
-          <w:rtl w:val="0"/>
-        </w:rPr>
-        <w:t xml:space="preserve">Esto eliminará también todas sus tareas asociadas si existe ON DELETE CASCADE.</w:t>
+        </w:rPr>
+        <w:drawing>
+          <wp:inline distB="114300" distT="114300" distL="114300" distR="114300">
+            <wp:extent cx="5372100" cy="6496050"/>
+            <wp:effectExtent b="0" l="0" r="0" t="0"/>
+            <wp:docPr id="3" name="image3.png"/>
+            <a:graphic>
+              <a:graphicData uri="http://schemas.openxmlformats.org/drawingml/2006/picture">
+                <pic:pic>
+                  <pic:nvPicPr>
+                    <pic:cNvPr id="0" name="image3.png"/>
+                    <pic:cNvPicPr preferRelativeResize="0"/>
+                  </pic:nvPicPr>
+                  <pic:blipFill>
+                    <a:blip r:embed="rId7"/>
+                    <a:srcRect b="0" l="0" r="0" t="0"/>
+                    <a:stretch>
+                      <a:fillRect/>
+                    </a:stretch>
+                  </pic:blipFill>
+                  <pic:spPr>
+                    <a:xfrm>
+                      <a:off x="0" y="0"/>
+                      <a:ext cx="5372100" cy="6496050"/>
+                    </a:xfrm>
+                    <a:prstGeom prst="rect"/>
+                    <a:ln/>
+                  </pic:spPr>
+                </pic:pic>
+              </a:graphicData>
+            </a:graphic>
+          </wp:inline>
+        </w:drawing>
+      </w:r>
+      <w:r>
+        <w:rPr>
+          <w:rtl w:val="0"/>
+        </w:rPr>
+      </w:r>
+    </w:p>
+    <w:p>
+      <w:pPr>
+        <w:ind w:left="567" w:firstLine="0"/>
+        <w:rPr>
+          <w:rFonts w:ascii="Consolas" w:cs="Consolas" w:eastAsia="Consolas" w:hAnsi="Consolas"/>
+          <w:sz w:val="20"/>
+          <w:szCs w:val="20"/>
+        </w:rPr>
+      </w:pPr>
+      <w:r>
+        <w:rPr>
+          <w:rtl w:val="0"/>
+        </w:rPr>
       </w:r>
     </w:p>
     <w:p>
@@ -279,7 +370,84 @@
         <w:rPr>
           <w:rtl w:val="0"/>
         </w:rPr>
+        <w:t xml:space="preserve">3.2 Eliminar Usuario</w:t>
+      </w:r>
+    </w:p>
+    <w:p>
+      <w:pPr>
+        <w:rPr/>
+      </w:pPr>
+      <w:r>
+        <w:rPr>
+          <w:rFonts w:ascii="Consolas" w:cs="Consolas" w:eastAsia="Consolas" w:hAnsi="Consolas"/>
+          <w:sz w:val="20"/>
+          <w:szCs w:val="20"/>
+        </w:rPr>
+        <w:drawing>
+          <wp:inline distB="114300" distT="114300" distL="114300" distR="114300">
+            <wp:extent cx="5133975" cy="5362575"/>
+            <wp:effectExtent b="0" l="0" r="0" t="0"/>
+            <wp:docPr id="1" name="image1.png"/>
+            <a:graphic>
+              <a:graphicData uri="http://schemas.openxmlformats.org/drawingml/2006/picture">
+                <pic:pic>
+                  <pic:nvPicPr>
+                    <pic:cNvPr id="0" name="image1.png"/>
+                    <pic:cNvPicPr preferRelativeResize="0"/>
+                  </pic:nvPicPr>
+                  <pic:blipFill>
+                    <a:blip r:embed="rId8"/>
+                    <a:srcRect b="0" l="0" r="0" t="0"/>
+                    <a:stretch>
+                      <a:fillRect/>
+                    </a:stretch>
+                  </pic:blipFill>
+                  <pic:spPr>
+                    <a:xfrm>
+                      <a:off x="0" y="0"/>
+                      <a:ext cx="5133975" cy="5362575"/>
+                    </a:xfrm>
+                    <a:prstGeom prst="rect"/>
+                    <a:ln/>
+                  </pic:spPr>
+                </pic:pic>
+              </a:graphicData>
+            </a:graphic>
+          </wp:inline>
+        </w:drawing>
+      </w:r>
+      <w:r>
+        <w:rPr>
+          <w:rtl w:val="0"/>
+        </w:rPr>
+      </w:r>
+    </w:p>
+    <w:p>
+      <w:pPr>
+        <w:pStyle w:val="Heading2"/>
+        <w:rPr/>
+      </w:pPr>
+      <w:r>
+        <w:rPr>
+          <w:rtl w:val="0"/>
+        </w:rPr>
         <w:t xml:space="preserve">3.3 Reiniciar Contraseña (Manual)</w:t>
+      </w:r>
+    </w:p>
+    <w:p>
+      <w:pPr>
+        <w:rPr/>
+      </w:pPr>
+      <w:r>
+        <w:rPr>
+          <w:rtl w:val="0"/>
+        </w:rPr>
+        <w:t xml:space="preserve">En esta versión del aplicativo no se cuenta con un reinicio de contraseña pero se tomará en cuenta para futuras versiones por el momento se tiene que cambiar en la base de datos.</w:t>
+      </w:r>
+      <w:r>
+        <w:rPr>
+          <w:rtl w:val="0"/>
+        </w:rPr>
       </w:r>
     </w:p>
     <w:p>
@@ -459,6 +627,25 @@
           <w:rtl w:val="0"/>
         </w:rPr>
         <w:t xml:space="preserve">mysqldump -u usuario -p nombre_base_de_datos &gt; respaldo.sql</w:t>
+      </w:r>
+    </w:p>
+    <w:p>
+      <w:pPr>
+        <w:jc w:val="left"/>
+        <w:rPr>
+          <w:rFonts w:ascii="Consolas" w:cs="Consolas" w:eastAsia="Consolas" w:hAnsi="Consolas"/>
+          <w:sz w:val="20"/>
+          <w:szCs w:val="20"/>
+        </w:rPr>
+      </w:pPr>
+      <w:r>
+        <w:rPr>
+          <w:rFonts w:ascii="Consolas" w:cs="Consolas" w:eastAsia="Consolas" w:hAnsi="Consolas"/>
+          <w:sz w:val="20"/>
+          <w:szCs w:val="20"/>
+          <w:rtl w:val="0"/>
+        </w:rPr>
+        <w:t xml:space="preserve">Este comando creará un respaldo de la base de datos que cuenta con la última versión.</w:t>
       </w:r>
     </w:p>
     <w:p>

</xml_diff>